<commit_message>
fix(app): quita la línea 'Real' de la cabecera y renombra el botón
La línea resumen juntaba todas las agencias y confundía. Se deja solo la
etiqueta de estado y la ventana solicitada; el detalle real por agencia
pasa al botón «Cobertura por agencia» (antes «Detalles»). Manuales y
.docx v1.4 actualizados.
</commit_message>
<xml_diff>
--- a/docs/versiones/manual_usuario_v1.4_2026-10-13.docx
+++ b/docs/versiones/manual_usuario_v1.4_2026-10-13.docx
@@ -2467,7 +2467,7 @@
         <w:t>UTC</w:t>
       </w:r>
       <w:r>
-        <w:t xml:space="preserve">. Debajo, la ventana muestra la </w:t>
+        <w:t xml:space="preserve">. Debajo se muestra la </w:t>
       </w:r>
       <w:r>
         <w:rPr>
@@ -2476,25 +2476,25 @@
         <w:t>ventana solicitada</w:t>
       </w:r>
       <w:r>
-        <w:t xml:space="preserve"> (común a las agencias) y la </w:t>
+        <w:t xml:space="preserve"> (común a las agencias) y un botón </w:t>
       </w:r>
       <w:r>
         <w:rPr>
           <w:b/>
         </w:rPr>
+        <w:t>«Cobertura por agencia»</w:t>
+      </w:r>
+      <w:r>
+        <w:t xml:space="preserve"> que abre una tabla con la </w:t>
+      </w:r>
+      <w:r>
+        <w:rPr>
+          <w:b/>
+        </w:rPr>
         <w:t>ventana real</w:t>
       </w:r>
       <w:r>
-        <w:t xml:space="preserve"> de cada una —el primer y el último evento que reportaron, con su cantidad—, y un botón </w:t>
-      </w:r>
-      <w:r>
-        <w:rPr>
-          <w:b/>
-        </w:rPr>
-        <w:t>«Detalles»</w:t>
-      </w:r>
-      <w:r>
-        <w:t xml:space="preserve"> abre una tabla con </w:t>
+        <w:t xml:space="preserve"> de cada una (</w:t>
       </w:r>
       <w:r>
         <w:rPr>
@@ -2504,7 +2504,7 @@
         <w:t>Agencia · Eventos · Desde (UTC) · Hasta (UTC) · Rezago</w:t>
       </w:r>
       <w:r>
-        <w:t xml:space="preserve">: el rezago es cuánto antes del fin solicitado terminó cada catálogo (por ejemplo, GFZ). Esa misma cobertura se incluye en la </w:t>
+        <w:t xml:space="preserve">): son el primer y el último evento que reportaron —no la cobertura total del catálogo— y el rezago es cuánto antes del fin solicitado terminó cada catálogo (por ejemplo, GFZ). Esa misma cobertura se incluye en la </w:t>
       </w:r>
       <w:r>
         <w:rPr>

</xml_diff>